<commit_message>
publish student projects (Fall 2026) 2026-09-22 19:23
</commit_message>
<xml_diff>
--- a/Education-Training/kopi-twin.docx
+++ b/Education-Training/kopi-twin.docx
@@ -2574,13 +2574,13 @@
         <w:rPr>
           <w:b/>
         </w:rPr>
-        <w:t xml:space="preserve">Recommended composition:</w:t>
-      </w:r>
-      <w:r>
-        <w:t xml:space="preserve"> </w:t>
-      </w:r>
-      <w:r>
-        <w:t xml:space="preserve">6 CS + 2 Design + 1 Art (9) — the</w:t>
+        <w:t xml:space="preserve">Team composition (set by instructor):</w:t>
+      </w:r>
+      <w:r>
+        <w:t xml:space="preserve"> </w:t>
+      </w:r>
+      <w:r>
+        <w:t xml:space="preserve">6 CS + 1 Design + 0 Art (7) — the</w:t>
       </w:r>
       <w:r>
         <w:t xml:space="preserve"> </w:t>
@@ -2595,7 +2595,52 @@
         <w:t xml:space="preserve"> </w:t>
       </w:r>
       <w:r>
-        <w:t xml:space="preserve">(the guided-lesson curriculum, the grading/competency rubric, the peak-hour scenario design, the error-feedback design and the wayfinding-free AR UX), so two designers own the design + UI/UX; one artist can carry the virtual kopitiam objects (cups, ingredients, equipment) as AR assets plus the instruction/HUD/dashboard visuals (rules: min 1 Design mandated, max 9 total, D+A ≤ 3; see</w:t>
+        <w:t xml:space="preserve">(the guided-lesson curriculum, the grading/competency rubric, the peak-hour scenario design, the error-feedback design and the wayfinding-free AR UX), and with</w:t>
+      </w:r>
+      <w:r>
+        <w:t xml:space="preserve"> </w:t>
+      </w:r>
+      <w:r>
+        <w:rPr>
+          <w:b/>
+        </w:rPr>
+        <w:t xml:space="preserve">no artist</w:t>
+      </w:r>
+      <w:r>
+        <w:t xml:space="preserve"> </w:t>
+      </w:r>
+      <w:r>
+        <w:t xml:space="preserve">the single designer owns all of that Design + UI/UX</w:t>
+      </w:r>
+      <w:r>
+        <w:t xml:space="preserve"> </w:t>
+      </w:r>
+      <w:r>
+        <w:rPr>
+          <w:i/>
+        </w:rPr>
+        <w:t xml:space="preserve">and</w:t>
+      </w:r>
+      <w:r>
+        <w:t xml:space="preserve"> </w:t>
+      </w:r>
+      <w:r>
+        <w:t xml:space="preserve">takes the</w:t>
+      </w:r>
+      <w:r>
+        <w:t xml:space="preserve"> </w:t>
+      </w:r>
+      <w:r>
+        <w:rPr>
+          <w:b/>
+        </w:rPr>
+        <w:t xml:space="preserve">D11 conditional</w:t>
+      </w:r>
+      <w:r>
+        <w:t xml:space="preserve"> </w:t>
+      </w:r>
+      <w:r>
+        <w:t xml:space="preserve">as a real graded Design goal each milestone (M1 Art Proof of Concept / M2 Art Implementation Quality — the last Design goal each milestone), which consumes one Design+UI slot per milestone (rules: min 1 Design mandated, max 9 total, D+A ≤ 3; see</w:t>
       </w:r>
       <w:r>
         <w:t xml:space="preserve"> </w:t>
@@ -2607,7 +2652,37 @@
         <w:t xml:space="preserve">team-formation.pdf</w:t>
       </w:r>
       <w:r>
-        <w:t xml:space="preserve">). If the AR asset set + dashboard visuals outgrow one artist, trade the 2nd designer for a 2nd artist. Note: for a training utility the audio floor is lighter (feedback cues + ambient kopitiam) — a lecturer waiver on heavy BGM may apply.</w:t>
+        <w:t xml:space="preserve">).</w:t>
+      </w:r>
+      <w:r>
+        <w:t xml:space="preserve"> </w:t>
+      </w:r>
+      <w:r>
+        <w:rPr>
+          <w:b/>
+        </w:rPr>
+        <w:t xml:space="preserve">Load + art-risk flag:</w:t>
+      </w:r>
+      <w:r>
+        <w:t xml:space="preserve"> </w:t>
+      </w:r>
+      <w:r>
+        <w:t xml:space="preserve">this is a heavy squeeze — the instructional/UX design load is genuinely large for one designer, and the AR kopitiam objects + instruction/HUD/dashboard are a real art surface, so 0 artists is a serious risk. Strongly consider a</w:t>
+      </w:r>
+      <w:r>
+        <w:t xml:space="preserve"> </w:t>
+      </w:r>
+      <w:r>
+        <w:rPr>
+          <w:b/>
+        </w:rPr>
+        <w:t xml:space="preserve">2nd designer</w:t>
+      </w:r>
+      <w:r>
+        <w:t xml:space="preserve"> </w:t>
+      </w:r>
+      <w:r>
+        <w:t xml:space="preserve">(to carry the instructional/UX load) and/or an artist within the D+A ≤ 3 cap; if the team stays 6 CS + 1 Design + 0 Art, scope the lessons/AR-object set hard and lean on a reusable style under D11 (a solo designer + 0 artists is the case the design pool flags). Note: for a training utility the audio floor is lighter (feedback cues + ambient kopitiam) — a lecturer waiver on heavy BGM may apply.</w:t>
       </w:r>
     </w:p>
     <w:p>
@@ -2675,31 +2750,7 @@
         <w:pStyle w:val="Compact"/>
       </w:pPr>
       <w:r>
-        <w:t xml:space="preserve">M1D3 User Research, Personas &amp; Competitive Analysis (trainee + trainer personas; teardown of Bartender VR Simulator / Diageo Bar Academy / video-tutorial training; findings into the FDD)</w:t>
-      </w:r>
-    </w:p>
-    <w:p>
-      <w:pPr>
-        <w:numPr>
-          <w:ilvl w:val="1"/>
-          <w:numId w:val="1018"/>
-        </w:numPr>
-        <w:pStyle w:val="Compact"/>
-      </w:pPr>
-      <w:r>
-        <w:t xml:space="preserve">M1D6 Level &amp; Progression Design → the lesson/scenario progression and the difficulty ramp from guided lessons to peak-hour</w:t>
-      </w:r>
-    </w:p>
-    <w:p>
-      <w:pPr>
-        <w:numPr>
-          <w:ilvl w:val="1"/>
-          <w:numId w:val="1018"/>
-        </w:numPr>
-        <w:pStyle w:val="Compact"/>
-      </w:pPr>
-      <w:r>
-        <w:t xml:space="preserve">M1D9 Playtest Plan &amp; First Playtests (protocol + ≥3 sessions with target trainees on the M1 lesson; findings triaged)</w:t>
+        <w:t xml:space="preserve">M1D11 Art Proof of Concept *(conditional — no artist; Design-owned)* — the learning-product visual direction: the virtual kopitiam AR objects (cups/ingredients/equipment) style plus the instruction/HUD and competency-dashboard visuals; 2 mockups. *(The artist's absence + the drop to one designer squeeze out the M1D3/D6/D9 instructional-design goals.)*</w:t>
       </w:r>
     </w:p>
     <w:p>
@@ -2738,31 +2789,7 @@
         <w:pStyle w:val="Compact"/>
       </w:pPr>
       <w:r>
-        <w:t xml:space="preserve">M2D5 Playtesting &amp; Iteration Program (test the guided-lesson clarity + the competency rubric with trainees, triaged)</w:t>
-      </w:r>
-    </w:p>
-    <w:p>
-      <w:pPr>
-        <w:numPr>
-          <w:ilvl w:val="1"/>
-          <w:numId w:val="1019"/>
-        </w:numPr>
-        <w:pStyle w:val="Compact"/>
-      </w:pPr>
-      <w:r>
-        <w:t xml:space="preserve">M2D6 Vertical Slice — one complete unit polished (guided lesson → peak-hour → competency result)</w:t>
-      </w:r>
-    </w:p>
-    <w:p>
-      <w:pPr>
-        <w:numPr>
-          <w:ilvl w:val="1"/>
-          <w:numId w:val="1019"/>
-        </w:numPr>
-        <w:pStyle w:val="Compact"/>
-      </w:pPr>
-      <w:r>
-        <w:t xml:space="preserve">M2D7 Systems Balance &amp; Tuning — Data-Driven (the grading thresholds, peak-hour difficulty and waste/time weights via the team's data)</w:t>
+        <w:t xml:space="preserve">M2D11 Art Implementation Quality *(conditional — no artist; Design-owned)* — the kopitiam AR objects, the instruction/HUD and the competency dashboard implemented in-engine, no placeholders.</w:t>
       </w:r>
     </w:p>
     <w:p>
@@ -2801,30 +2828,6 @@
     <w:p>
       <w:pPr>
         <w:numPr>
-          <w:ilvl w:val="1"/>
-          <w:numId w:val="1020"/>
-        </w:numPr>
-        <w:pStyle w:val="Compact"/>
-      </w:pPr>
-      <w:r>
-        <w:t xml:space="preserve">M1U2 UX Flows &amp; Wireframes — lesson-select → AR setup → guided steps → result → dashboard, wireframed end to end.</w:t>
-      </w:r>
-    </w:p>
-    <w:p>
-      <w:pPr>
-        <w:numPr>
-          <w:ilvl w:val="1"/>
-          <w:numId w:val="1020"/>
-        </w:numPr>
-        <w:pStyle w:val="Compact"/>
-      </w:pPr>
-      <w:r>
-        <w:t xml:space="preserve">M1U3 Accessibility &amp; Readability Foundations — contrast, type scale and touch targets legible against a camera background.</w:t>
-      </w:r>
-    </w:p>
-    <w:p>
-      <w:pPr>
-        <w:numPr>
           <w:ilvl w:val="0"/>
           <w:numId w:val="1017"/>
         </w:numPr>
@@ -2864,30 +2867,6 @@
     <w:p>
       <w:pPr>
         <w:numPr>
-          <w:ilvl w:val="1"/>
-          <w:numId w:val="1021"/>
-        </w:numPr>
-        <w:pStyle w:val="Compact"/>
-      </w:pPr>
-      <w:r>
-        <w:t xml:space="preserve">M2U4 Onboarding &amp; Tutorial Design — get a first-time trainee from install to first graded drink without a wall of text.</w:t>
-      </w:r>
-    </w:p>
-    <w:p>
-      <w:pPr>
-        <w:numPr>
-          <w:ilvl w:val="1"/>
-          <w:numId w:val="1021"/>
-        </w:numPr>
-        <w:pStyle w:val="Compact"/>
-      </w:pPr>
-      <w:r>
-        <w:t xml:space="preserve">M2U5 Mobile UX Adaptation &amp; Ergonomics — one-handed / device-held AR use, safe areas, session-length fit on the Pixel 9a.</w:t>
-      </w:r>
-    </w:p>
-    <w:p>
-      <w:pPr>
-        <w:numPr>
           <w:ilvl w:val="0"/>
           <w:numId w:val="1017"/>
         </w:numPr>
@@ -2897,49 +2876,13 @@
         <w:rPr>
           <w:b/>
         </w:rPr>
-        <w:t xml:space="preserve">Art M1:</w:t>
-      </w:r>
-      <w:r>
-        <w:t xml:space="preserve"> </w:t>
-      </w:r>
-      <w:r>
-        <w:t xml:space="preserve">1 artist (AR objects + UI/dashboard visuals)</w:t>
-      </w:r>
-    </w:p>
-    <w:p>
-      <w:pPr>
-        <w:numPr>
-          <w:ilvl w:val="1"/>
-          <w:numId w:val="1022"/>
-        </w:numPr>
-        <w:pStyle w:val="Compact"/>
-      </w:pPr>
-      <w:r>
-        <w:t xml:space="preserve">M1A1 ⭐ Art Bible / Proof of Concept (the kopitiam visual language, the virtual-equipment style, instruction iconography)</w:t>
-      </w:r>
-    </w:p>
-    <w:p>
-      <w:pPr>
-        <w:numPr>
-          <w:ilvl w:val="1"/>
-          <w:numId w:val="1022"/>
-        </w:numPr>
-        <w:pStyle w:val="Compact"/>
-      </w:pPr>
-      <w:r>
-        <w:t xml:space="preserve">M1A3 Environment, Props &amp; VFX Concepts (the virtual kopi equipment/ingredients/cups AR props + error/success feedback VFX concepts)</w:t>
-      </w:r>
-    </w:p>
-    <w:p>
-      <w:pPr>
-        <w:numPr>
-          <w:ilvl w:val="1"/>
-          <w:numId w:val="1022"/>
-        </w:numPr>
-        <w:pStyle w:val="Compact"/>
-      </w:pPr>
-      <w:r>
-        <w:t xml:space="preserve">M1A4 UI Art Concepts &amp; Typography (instruction overlays, order/timer/error HUD, dashboard visuals, large readable type over camera)</w:t>
+        <w:t xml:space="preserve">Art:</w:t>
+      </w:r>
+      <w:r>
+        <w:t xml:space="preserve"> </w:t>
+      </w:r>
+      <w:r>
+        <w:t xml:space="preserve">0 artists — the art surface (the virtual kopitiam AR objects — cups/ingredients/equipment — plus the instruction/HUD and competency-dashboard visuals) is covered by the D11 conditionals, taken as Design goals by the single designer (see Design M1/M2). The AR-object + dashboard art is a real surface, so 0 artists is a serious risk — scope the AR-object set hard and lean on a reusable style.</w:t>
       </w:r>
     </w:p>
     <w:p>
@@ -2954,43 +2897,31 @@
         <w:rPr>
           <w:b/>
         </w:rPr>
-        <w:t xml:space="preserve">Art M2:</w:t>
-      </w:r>
-    </w:p>
-    <w:p>
-      <w:pPr>
-        <w:numPr>
-          <w:ilvl w:val="1"/>
-          <w:numId w:val="1023"/>
-        </w:numPr>
-        <w:pStyle w:val="Compact"/>
-      </w:pPr>
-      <w:r>
-        <w:t xml:space="preserve">M2A1 ⭐ Critical Asset Production &amp; In-Engine Visual Quality (the AR props + HUD + dashboard implemented and consistent)</w:t>
-      </w:r>
-    </w:p>
-    <w:p>
-      <w:pPr>
-        <w:numPr>
-          <w:ilvl w:val="1"/>
-          <w:numId w:val="1023"/>
-        </w:numPr>
-        <w:pStyle w:val="Compact"/>
-      </w:pPr>
-      <w:r>
-        <w:t xml:space="preserve">M2A4 UI Art — States &amp; Feedback (correct / incorrect / skipped-step / peak-hour-pressure states; dashboard charts)</w:t>
-      </w:r>
-    </w:p>
-    <w:p>
-      <w:pPr>
-        <w:numPr>
-          <w:ilvl w:val="1"/>
-          <w:numId w:val="1023"/>
-        </w:numPr>
-        <w:pStyle w:val="Compact"/>
-      </w:pPr>
-      <w:r>
-        <w:t xml:space="preserve">M2A5 VFX — Critical Effects &amp; Transitions (immediate error/success feedback effects, completion/celebration)</w:t>
+        <w:t xml:space="preserve">TEAM M1:</w:t>
+      </w:r>
+    </w:p>
+    <w:p>
+      <w:pPr>
+        <w:numPr>
+          <w:ilvl w:val="1"/>
+          <w:numId w:val="1022"/>
+        </w:numPr>
+        <w:pStyle w:val="Compact"/>
+      </w:pPr>
+      <w:r>
+        <w:t xml:space="preserve">M1TA1 ⭐ Overall Audio Experience — initial audio from the week-5 needs list present &amp; working (kopitiam ambience + interaction, correct/incorrect and order cues), suitable and correctly triggered (a lecturer waiver on heavy BGM may apply for this training utility).</w:t>
+      </w:r>
+    </w:p>
+    <w:p>
+      <w:pPr>
+        <w:numPr>
+          <w:ilvl w:val="1"/>
+          <w:numId w:val="1022"/>
+        </w:numPr>
+        <w:pStyle w:val="Compact"/>
+      </w:pPr>
+      <w:r>
+        <w:t xml:space="preserve">M1TA2 ⭐ Audio Engine Functionality — data-driven audio pipeline (add/replace files without recompiling) + reliable multi-channel playback for overlapping feedback cues.</w:t>
       </w:r>
     </w:p>
     <w:p>
@@ -3005,45 +2936,6 @@
         <w:rPr>
           <w:b/>
         </w:rPr>
-        <w:t xml:space="preserve">TEAM M1:</w:t>
-      </w:r>
-    </w:p>
-    <w:p>
-      <w:pPr>
-        <w:numPr>
-          <w:ilvl w:val="1"/>
-          <w:numId w:val="1024"/>
-        </w:numPr>
-        <w:pStyle w:val="Compact"/>
-      </w:pPr>
-      <w:r>
-        <w:t xml:space="preserve">M1TA1 ⭐ Overall Audio Experience — initial audio from the week-5 needs list present &amp; working (kopitiam ambience + interaction, correct/incorrect and order cues), suitable and correctly triggered (a lecturer waiver on heavy BGM may apply for this training utility).</w:t>
-      </w:r>
-    </w:p>
-    <w:p>
-      <w:pPr>
-        <w:numPr>
-          <w:ilvl w:val="1"/>
-          <w:numId w:val="1024"/>
-        </w:numPr>
-        <w:pStyle w:val="Compact"/>
-      </w:pPr>
-      <w:r>
-        <w:t xml:space="preserve">M1TA2 ⭐ Audio Engine Functionality — data-driven audio pipeline (add/replace files without recompiling) + reliable multi-channel playback for overlapping feedback cues.</w:t>
-      </w:r>
-    </w:p>
-    <w:p>
-      <w:pPr>
-        <w:numPr>
-          <w:ilvl w:val="0"/>
-          <w:numId w:val="1017"/>
-        </w:numPr>
-        <w:pStyle w:val="Compact"/>
-      </w:pPr>
-      <w:r>
-        <w:rPr>
-          <w:b/>
-        </w:rPr>
         <w:t xml:space="preserve">TEAM M2:</w:t>
       </w:r>
     </w:p>
@@ -3051,7 +2943,7 @@
       <w:pPr>
         <w:numPr>
           <w:ilvl w:val="1"/>
-          <w:numId w:val="1025"/>
+          <w:numId w:val="1023"/>
         </w:numPr>
         <w:pStyle w:val="Compact"/>
       </w:pPr>
@@ -3063,7 +2955,7 @@
       <w:pPr>
         <w:numPr>
           <w:ilvl w:val="1"/>
-          <w:numId w:val="1025"/>
+          <w:numId w:val="1023"/>
         </w:numPr>
         <w:pStyle w:val="Compact"/>
       </w:pPr>
@@ -3075,7 +2967,7 @@
       <w:pPr>
         <w:numPr>
           <w:ilvl w:val="1"/>
-          <w:numId w:val="1025"/>
+          <w:numId w:val="1023"/>
         </w:numPr>
         <w:pStyle w:val="Compact"/>
       </w:pPr>
@@ -3420,12 +3312,6 @@
     <w:abstractNumId w:val="991"/>
   </w:num>
   <w:num w:numId="1023">
-    <w:abstractNumId w:val="991"/>
-  </w:num>
-  <w:num w:numId="1024">
-    <w:abstractNumId w:val="991"/>
-  </w:num>
-  <w:num w:numId="1025">
     <w:abstractNumId w:val="991"/>
   </w:num>
 </w:numbering>

</xml_diff>